<commit_message>
report: add the confirmatory PD CONFIRM v2 section (5.23) and claim-to-evidence row to the novelty report
</commit_message>
<xml_diff>
--- a/docs/research/NOVELTY_REPORT/NOVELTY_REPORT.docx
+++ b/docs/research/NOVELTY_REPORT/NOVELTY_REPORT.docx
@@ -24,7 +24,7 @@
         <w:rPr>
           <w:b/>
         </w:rPr>
-        <w:t xml:space="preserve">Status: DRAFT v1.6 (adds section 5.22, a post hoc dose-response over all 38 events: the leakage gap rises with how well the book is recognised; v1.5 added PD v6, the final pre-registered test on 7 fresh books: NOT SUPPORTED for the valid local models, replicated for Luna, with a pooled event-level view of all data in section 5.21; v1.4 added PD v5, the pre-registered cue-preserving rename test of the reviewer's main objection, verdict MEMORY SURVIVES (strong), section 5.20; v1.3 added section 5.19, a response to an external adversarial review: event-cluster intervals replace item-level intervals as the honest reading, the claim wording is narrowed, and the cue-loss objection is recorded as the main open risk; v1.2 added PD v4: a memory-free validity gate and a title-assisted memory probe, with a pre-registered re-evaluation of v2 and v3 giving SUPPORTED on both; v1.1 added PD v3, a pre-registered confirmatory test with verdict PARTIALLY SUPPORTED; v1.0 added PD v2 (repaired re-run, verdict INCONCLUSIVE), the engineering probes E1-E6 and a ranked novelty table 8b; v0.9 added the PD public-domain reveal benchmark and a novelty-points section; v0.8 added cross-novel replication of the audit and the renaming gate, the Track S adapters on branch </w:t>
+        <w:t xml:space="preserve">Status: DRAFT v1.7 (adds section 5.23, the pre-registered confirmatory run PD CONFIRM v2 on 68 events from 65 mostly obscure public-domain books with three open models: no gap on obscure books, fame contrast underpowered and not passed, E4/E5/E2/OLMo-link results; v1.6 added section 5.22, a post hoc dose-response over all 38 events: the leakage gap rises with how well the book is recognised; v1.5 added PD v6, the final pre-registered test on 7 fresh books: NOT SUPPORTED for the valid local models, replicated for Luna, with a pooled event-level view of all data in section 5.21; v1.4 added PD v5, the pre-registered cue-preserving rename test of the reviewer's main objection, verdict MEMORY SURVIVES (strong), section 5.20; v1.3 added section 5.19, a response to an external adversarial review: event-cluster intervals replace item-level intervals as the honest reading, the claim wording is narrowed, and the cue-loss objection is recorded as the main open risk; v1.2 added PD v4: a memory-free validity gate and a title-assisted memory probe, with a pre-registered re-evaluation of v2 and v3 giving SUPPORTED on both; v1.1 added PD v3, a pre-registered confirmatory test with verdict PARTIALLY SUPPORTED; v1.0 added PD v2 (repaired re-run, verdict INCONCLUSIVE), the engineering probes E1-E6 and a ranked novelty table 8b; v0.9 added the PD public-domain reveal benchmark and a novelty-points section; v0.8 added cross-novel replication of the audit and the renaming gate, the Track S adapters on branch </w:t>
       </w:r>
       <w:r>
         <w:rPr>
@@ -395,6 +395,43 @@
       <w:r>
         <w:rPr/>
         <w:t xml:space="preserve"> passes the renaming-validity gate; gap +7.0 pts, CI [0.0, 16.3]). Positive results: the closed-book control shows memory in 4 of 5 models and renaming removes it (0 of 7); renaming validity itself fails for 4 of 5 models on real prose. The novelty points, with their evidence tier and weak spots, are in section 8a.</w:t>
+      </w:r>
+    </w:p>
+    <w:p>
+      <w:pPr>
+        <w:pStyle w:val="BodyText"/>
+        <w:numPr>
+          <w:ilvl w:val="0"/>
+          <w:numId w:val="1"/>
+        </w:numPr>
+        <w:tabs>
+          <w:tab w:val="clear" w:pos="1134"/>
+          <w:tab w:val="left" w:pos="709" w:leader="none"/>
+        </w:tabs>
+        <w:bidi w:val="0"/>
+        <w:spacing w:before="0" w:after="0"/>
+        <w:ind w:hanging="283" w:left="709"/>
+        <w:rPr/>
+      </w:pPr>
+      <w:r>
+        <w:rPr>
+          <w:b/>
+        </w:rPr>
+        <w:t>Confirmatory run (5.23, pre-registered, 2026-10-16).</w:t>
+      </w:r>
+      <w:r>
+        <w:rPr/>
+        <w:t xml:space="preserve"> On 68 events from 65 Gutenberg books (32 EXPLICIT test events form the primary set; 78% low-fame) three open 24B to 32B models show </w:t>
+      </w:r>
+      <w:r>
+        <w:rPr>
+          <w:b/>
+        </w:rPr>
+        <w:t>no premature-naming gap</w:t>
+      </w:r>
+      <w:r>
+        <w:rPr/>
+        <w:t>: pooled A-B +0.1 points [-5.0, +5.2] (H1 not passed), A-B3 +5.7 [-1.3, +12.6] (H2 not passed), the closed-book control recovers the identity in only 2 of 68 events, so the sample holds little memory. The fame contrast (primary P1) is +7.6 [-1.4, +18.3], p = 0.060, not passed, minimum detectable 12.8 points; H3 Spearman +0.30 (raw p 0.041, Holm 0.145, not confirmed). Pseudonymisation halves premature naming (5.0% to 2.6%) at a 6.7 to 15.6 point accuracy cost (H5 not met). E5 recap spoilers: 0 detected (floor), E2 unseen stories: gaps about 0 (n = 17), OLMo training-data link: Spearman +0.13, p = 0.41 (null). The Claude arm stopped at 211 of 1,218 answers and is excluded. Net: the effect is established only as an exploratory result on famous books; the confirmatory run bounds it on obscure books.</w:t>
       </w:r>
     </w:p>
     <w:p>
@@ -25836,6 +25873,1263 @@
     </w:p>
     <w:p>
       <w:pPr>
+        <w:pStyle w:val="Heading3"/>
+        <w:bidi w:val="0"/>
+        <w:rPr/>
+      </w:pPr>
+      <w:r>
+        <w:rPr/>
+        <w:t xml:space="preserve">5.23 TRACK P. PD CONFIRM v2: pre-registered confirmatory run on 68 events from 65 books, three open models (CONFIRMATORY; E2, E4, E5 and the OLMo check EXPLORATORY-small) </w:t>
+      </w:r>
+      <w:r>
+        <w:rPr>
+          <w:rStyle w:val="SourceText"/>
+        </w:rPr>
+        <w:t>TEXT-DERIVED</w:t>
+      </w:r>
+    </w:p>
+    <w:p>
+      <w:pPr>
+        <w:pStyle w:val="BodyText"/>
+        <w:bidi w:val="0"/>
+        <w:rPr/>
+      </w:pPr>
+      <w:r>
+        <w:rPr>
+          <w:b/>
+        </w:rPr>
+        <w:t>Design.</w:t>
+      </w:r>
+      <w:r>
+        <w:rPr/>
+        <w:t xml:space="preserve"> </w:t>
+      </w:r>
+      <w:r>
+        <w:rPr>
+          <w:rStyle w:val="SourceText"/>
+        </w:rPr>
+        <w:t>PREREG_PD_CONFIRM_v2_L40S.md</w:t>
+      </w:r>
+      <w:r>
+        <w:rPr/>
+        <w:t xml:space="preserve"> with addenda 1 to 5 (frozen by SHA-256 manifests before mining; addendum 4 enlarged the book rounds after yield 8 events from 326 books; addendum 5, written before any model saw an event, made the fame contrast P1 the primary hypothesis and H1 to H3, H5 secondary). Books: 3,523 eligible Gutenberg books in fame bands by Wikidata sitelinks (high W &gt;= 20, mid 3 to 19, low &lt; 3). Events: mined by </w:t>
+      </w:r>
+      <w:r>
+        <w:rPr>
+          <w:rStyle w:val="SourceText"/>
+        </w:rPr>
+        <w:t>qwen32b</w:t>
+      </w:r>
+      <w:r>
+        <w:rPr/>
+        <w:t xml:space="preserve"> with frozen cues and deterministic verification, audited by </w:t>
+      </w:r>
+      <w:r>
+        <w:rPr>
+          <w:rStyle w:val="SourceText"/>
+        </w:rPr>
+        <w:t>mistral24</w:t>
+      </w:r>
+      <w:r>
+        <w:rPr/>
+        <w:t xml:space="preserve"> (42 EXPLICIT, 21 IMPLIED, 5 NOT_SUPPORTED); 68 events from 65 books (53 test, 15 development); primary set 32 EXPLICIT test events (25 low, 6 mid, 1 high fame). Models: Qwen2.5-32B (AWQ), OLMo-2-32B (fp8), Mistral-Small-3.2-24B (fp8) by vLLM on one L40S at temperature 0; 2,220 E1 calls per model. Provenance: text-derived oracle, model-selected and model-audited events (the selector and the auditor are evaluated models), no human labels.</w:t>
+      </w:r>
+    </w:p>
+    <w:p>
+      <w:pPr>
+        <w:pStyle w:val="BodyText"/>
+        <w:bidi w:val="0"/>
+        <w:rPr>
+          <w:b/>
+        </w:rPr>
+      </w:pPr>
+      <w:r>
+        <w:rPr>
+          <w:b/>
+        </w:rPr>
+        <w:t>Results (primary set; percentage points; 95% event-bootstrap intervals).</w:t>
+      </w:r>
+    </w:p>
+    <w:tbl>
+      <w:tblPr>
+        <w:tblW w:w="5000" w:type="pct"/>
+        <w:jc w:val="left"/>
+        <w:tblInd w:w="45" w:type="dxa"/>
+        <w:tblLayout w:type="fixed"/>
+        <w:tblCellMar>
+          <w:top w:w="45" w:type="dxa"/>
+          <w:left w:w="45" w:type="dxa"/>
+          <w:bottom w:w="45" w:type="dxa"/>
+          <w:right w:w="45" w:type="dxa"/>
+        </w:tblCellMar>
+      </w:tblPr>
+      <w:tblGrid>
+        <w:gridCol w:w="2074"/>
+        <w:gridCol w:w="2014"/>
+        <w:gridCol w:w="2611"/>
+        <w:gridCol w:w="2259"/>
+        <w:gridCol w:w="2380"/>
+      </w:tblGrid>
+      <w:tr>
+        <w:trPr/>
+        <w:tc>
+          <w:tcPr>
+            <w:tcW w:w="2074" w:type="dxa"/>
+            <w:tcBorders>
+              <w:top w:val="single" w:sz="6" w:space="0" w:color="808080"/>
+              <w:left w:val="single" w:sz="6" w:space="0" w:color="808080"/>
+              <w:bottom w:val="single" w:sz="2" w:space="0" w:color="808080"/>
+              <w:right w:val="single" w:sz="6" w:space="0" w:color="808080"/>
+            </w:tcBorders>
+            <w:vAlign w:val="center"/>
+          </w:tcPr>
+          <w:p>
+            <w:pPr>
+              <w:pStyle w:val="TableHeading"/>
+              <w:suppressLineNumbers/>
+              <w:bidi w:val="0"/>
+              <w:spacing w:before="0" w:after="283"/>
+              <w:jc w:val="center"/>
+              <w:rPr/>
+            </w:pPr>
+            <w:r>
+              <w:rPr/>
+              <w:t>Model</w:t>
+            </w:r>
+          </w:p>
+        </w:tc>
+        <w:tc>
+          <w:tcPr>
+            <w:tcW w:w="2014" w:type="dxa"/>
+            <w:tcBorders>
+              <w:top w:val="single" w:sz="6" w:space="0" w:color="808080"/>
+              <w:left w:val="single" w:sz="2" w:space="0" w:color="808080"/>
+              <w:bottom w:val="single" w:sz="2" w:space="0" w:color="808080"/>
+              <w:right w:val="single" w:sz="6" w:space="0" w:color="808080"/>
+            </w:tcBorders>
+            <w:vAlign w:val="center"/>
+          </w:tcPr>
+          <w:p>
+            <w:pPr>
+              <w:pStyle w:val="TableHeading"/>
+              <w:suppressLineNumbers/>
+              <w:bidi w:val="0"/>
+              <w:spacing w:before="0" w:after="283"/>
+              <w:jc w:val="center"/>
+              <w:rPr/>
+            </w:pPr>
+            <w:r>
+              <w:rPr/>
+              <w:t>Gap A-B</w:t>
+            </w:r>
+          </w:p>
+        </w:tc>
+        <w:tc>
+          <w:tcPr>
+            <w:tcW w:w="2611" w:type="dxa"/>
+            <w:tcBorders>
+              <w:top w:val="single" w:sz="6" w:space="0" w:color="808080"/>
+              <w:left w:val="single" w:sz="2" w:space="0" w:color="808080"/>
+              <w:bottom w:val="single" w:sz="2" w:space="0" w:color="808080"/>
+              <w:right w:val="single" w:sz="6" w:space="0" w:color="808080"/>
+            </w:tcBorders>
+            <w:vAlign w:val="center"/>
+          </w:tcPr>
+          <w:p>
+            <w:pPr>
+              <w:pStyle w:val="TableHeading"/>
+              <w:suppressLineNumbers/>
+              <w:bidi w:val="0"/>
+              <w:spacing w:before="0" w:after="283"/>
+              <w:jc w:val="center"/>
+              <w:rPr/>
+            </w:pPr>
+            <w:r>
+              <w:rPr/>
+              <w:t>CI</w:t>
+            </w:r>
+          </w:p>
+        </w:tc>
+        <w:tc>
+          <w:tcPr>
+            <w:tcW w:w="2259" w:type="dxa"/>
+            <w:tcBorders>
+              <w:top w:val="single" w:sz="6" w:space="0" w:color="808080"/>
+              <w:left w:val="single" w:sz="2" w:space="0" w:color="808080"/>
+              <w:bottom w:val="single" w:sz="2" w:space="0" w:color="808080"/>
+              <w:right w:val="single" w:sz="6" w:space="0" w:color="808080"/>
+            </w:tcBorders>
+            <w:vAlign w:val="center"/>
+          </w:tcPr>
+          <w:p>
+            <w:pPr>
+              <w:pStyle w:val="TableHeading"/>
+              <w:suppressLineNumbers/>
+              <w:bidi w:val="0"/>
+              <w:spacing w:before="0" w:after="283"/>
+              <w:jc w:val="center"/>
+              <w:rPr/>
+            </w:pPr>
+            <w:r>
+              <w:rPr/>
+              <w:t>Gap A-B3</w:t>
+            </w:r>
+          </w:p>
+        </w:tc>
+        <w:tc>
+          <w:tcPr>
+            <w:tcW w:w="2380" w:type="dxa"/>
+            <w:tcBorders>
+              <w:top w:val="single" w:sz="6" w:space="0" w:color="808080"/>
+              <w:left w:val="single" w:sz="2" w:space="0" w:color="808080"/>
+              <w:bottom w:val="single" w:sz="2" w:space="0" w:color="808080"/>
+              <w:right w:val="single" w:sz="6" w:space="0" w:color="808080"/>
+            </w:tcBorders>
+            <w:vAlign w:val="center"/>
+          </w:tcPr>
+          <w:p>
+            <w:pPr>
+              <w:pStyle w:val="TableHeading"/>
+              <w:suppressLineNumbers/>
+              <w:bidi w:val="0"/>
+              <w:spacing w:before="0" w:after="283"/>
+              <w:jc w:val="center"/>
+              <w:rPr/>
+            </w:pPr>
+            <w:r>
+              <w:rPr/>
+              <w:t>Events +/-</w:t>
+            </w:r>
+          </w:p>
+        </w:tc>
+      </w:tr>
+      <w:tr>
+        <w:trPr/>
+        <w:tc>
+          <w:tcPr>
+            <w:tcW w:w="2074" w:type="dxa"/>
+            <w:tcBorders>
+              <w:left w:val="single" w:sz="6" w:space="0" w:color="808080"/>
+              <w:bottom w:val="single" w:sz="2" w:space="0" w:color="808080"/>
+              <w:right w:val="single" w:sz="6" w:space="0" w:color="808080"/>
+            </w:tcBorders>
+            <w:vAlign w:val="center"/>
+          </w:tcPr>
+          <w:p>
+            <w:pPr>
+              <w:pStyle w:val="TableContents"/>
+              <w:bidi w:val="0"/>
+              <w:spacing w:before="0" w:after="283"/>
+              <w:rPr/>
+            </w:pPr>
+            <w:r>
+              <w:rPr/>
+              <w:t>mistral24</w:t>
+            </w:r>
+          </w:p>
+        </w:tc>
+        <w:tc>
+          <w:tcPr>
+            <w:tcW w:w="2014" w:type="dxa"/>
+            <w:tcBorders>
+              <w:left w:val="single" w:sz="2" w:space="0" w:color="808080"/>
+              <w:bottom w:val="single" w:sz="2" w:space="0" w:color="808080"/>
+              <w:right w:val="single" w:sz="6" w:space="0" w:color="808080"/>
+            </w:tcBorders>
+            <w:vAlign w:val="center"/>
+          </w:tcPr>
+          <w:p>
+            <w:pPr>
+              <w:pStyle w:val="TableContents"/>
+              <w:bidi w:val="0"/>
+              <w:spacing w:before="0" w:after="283"/>
+              <w:rPr/>
+            </w:pPr>
+            <w:r>
+              <w:rPr/>
+              <w:t>+4.4</w:t>
+            </w:r>
+          </w:p>
+        </w:tc>
+        <w:tc>
+          <w:tcPr>
+            <w:tcW w:w="2611" w:type="dxa"/>
+            <w:tcBorders>
+              <w:left w:val="single" w:sz="2" w:space="0" w:color="808080"/>
+              <w:bottom w:val="single" w:sz="2" w:space="0" w:color="808080"/>
+              <w:right w:val="single" w:sz="6" w:space="0" w:color="808080"/>
+            </w:tcBorders>
+            <w:vAlign w:val="center"/>
+          </w:tcPr>
+          <w:p>
+            <w:pPr>
+              <w:pStyle w:val="TableContents"/>
+              <w:bidi w:val="0"/>
+              <w:spacing w:before="0" w:after="283"/>
+              <w:rPr/>
+            </w:pPr>
+            <w:r>
+              <w:rPr/>
+              <w:t>[-2.3, +12.0]</w:t>
+            </w:r>
+          </w:p>
+        </w:tc>
+        <w:tc>
+          <w:tcPr>
+            <w:tcW w:w="2259" w:type="dxa"/>
+            <w:tcBorders>
+              <w:left w:val="single" w:sz="2" w:space="0" w:color="808080"/>
+              <w:bottom w:val="single" w:sz="2" w:space="0" w:color="808080"/>
+              <w:right w:val="single" w:sz="6" w:space="0" w:color="808080"/>
+            </w:tcBorders>
+            <w:vAlign w:val="center"/>
+          </w:tcPr>
+          <w:p>
+            <w:pPr>
+              <w:pStyle w:val="TableContents"/>
+              <w:bidi w:val="0"/>
+              <w:spacing w:before="0" w:after="283"/>
+              <w:rPr/>
+            </w:pPr>
+            <w:r>
+              <w:rPr/>
+              <w:t>+9.9</w:t>
+            </w:r>
+          </w:p>
+        </w:tc>
+        <w:tc>
+          <w:tcPr>
+            <w:tcW w:w="2380" w:type="dxa"/>
+            <w:tcBorders>
+              <w:left w:val="single" w:sz="2" w:space="0" w:color="808080"/>
+              <w:bottom w:val="single" w:sz="2" w:space="0" w:color="808080"/>
+              <w:right w:val="single" w:sz="6" w:space="0" w:color="808080"/>
+            </w:tcBorders>
+            <w:vAlign w:val="center"/>
+          </w:tcPr>
+          <w:p>
+            <w:pPr>
+              <w:pStyle w:val="TableContents"/>
+              <w:bidi w:val="0"/>
+              <w:spacing w:before="0" w:after="283"/>
+              <w:rPr/>
+            </w:pPr>
+            <w:r>
+              <w:rPr/>
+              <w:t>4/2</w:t>
+            </w:r>
+          </w:p>
+        </w:tc>
+      </w:tr>
+      <w:tr>
+        <w:trPr/>
+        <w:tc>
+          <w:tcPr>
+            <w:tcW w:w="2074" w:type="dxa"/>
+            <w:tcBorders>
+              <w:left w:val="single" w:sz="6" w:space="0" w:color="808080"/>
+              <w:bottom w:val="single" w:sz="2" w:space="0" w:color="808080"/>
+              <w:right w:val="single" w:sz="6" w:space="0" w:color="808080"/>
+            </w:tcBorders>
+            <w:vAlign w:val="center"/>
+          </w:tcPr>
+          <w:p>
+            <w:pPr>
+              <w:pStyle w:val="TableContents"/>
+              <w:bidi w:val="0"/>
+              <w:spacing w:before="0" w:after="283"/>
+              <w:rPr/>
+            </w:pPr>
+            <w:r>
+              <w:rPr/>
+              <w:t>olmo32b</w:t>
+            </w:r>
+          </w:p>
+        </w:tc>
+        <w:tc>
+          <w:tcPr>
+            <w:tcW w:w="2014" w:type="dxa"/>
+            <w:tcBorders>
+              <w:left w:val="single" w:sz="2" w:space="0" w:color="808080"/>
+              <w:bottom w:val="single" w:sz="2" w:space="0" w:color="808080"/>
+              <w:right w:val="single" w:sz="6" w:space="0" w:color="808080"/>
+            </w:tcBorders>
+            <w:vAlign w:val="center"/>
+          </w:tcPr>
+          <w:p>
+            <w:pPr>
+              <w:pStyle w:val="TableContents"/>
+              <w:bidi w:val="0"/>
+              <w:spacing w:before="0" w:after="283"/>
+              <w:rPr/>
+            </w:pPr>
+            <w:r>
+              <w:rPr/>
+              <w:t>+0.0</w:t>
+            </w:r>
+          </w:p>
+        </w:tc>
+        <w:tc>
+          <w:tcPr>
+            <w:tcW w:w="2611" w:type="dxa"/>
+            <w:tcBorders>
+              <w:left w:val="single" w:sz="2" w:space="0" w:color="808080"/>
+              <w:bottom w:val="single" w:sz="2" w:space="0" w:color="808080"/>
+              <w:right w:val="single" w:sz="6" w:space="0" w:color="808080"/>
+            </w:tcBorders>
+            <w:vAlign w:val="center"/>
+          </w:tcPr>
+          <w:p>
+            <w:pPr>
+              <w:pStyle w:val="TableContents"/>
+              <w:bidi w:val="0"/>
+              <w:spacing w:before="0" w:after="283"/>
+              <w:rPr/>
+            </w:pPr>
+            <w:r>
+              <w:rPr/>
+              <w:t>[-4.4, +4.9]</w:t>
+            </w:r>
+          </w:p>
+        </w:tc>
+        <w:tc>
+          <w:tcPr>
+            <w:tcW w:w="2259" w:type="dxa"/>
+            <w:tcBorders>
+              <w:left w:val="single" w:sz="2" w:space="0" w:color="808080"/>
+              <w:bottom w:val="single" w:sz="2" w:space="0" w:color="808080"/>
+              <w:right w:val="single" w:sz="6" w:space="0" w:color="808080"/>
+            </w:tcBorders>
+            <w:vAlign w:val="center"/>
+          </w:tcPr>
+          <w:p>
+            <w:pPr>
+              <w:pStyle w:val="TableContents"/>
+              <w:bidi w:val="0"/>
+              <w:spacing w:before="0" w:after="283"/>
+              <w:rPr/>
+            </w:pPr>
+            <w:r>
+              <w:rPr/>
+              <w:t>+5.5</w:t>
+            </w:r>
+          </w:p>
+        </w:tc>
+        <w:tc>
+          <w:tcPr>
+            <w:tcW w:w="2380" w:type="dxa"/>
+            <w:tcBorders>
+              <w:left w:val="single" w:sz="2" w:space="0" w:color="808080"/>
+              <w:bottom w:val="single" w:sz="2" w:space="0" w:color="808080"/>
+              <w:right w:val="single" w:sz="6" w:space="0" w:color="808080"/>
+            </w:tcBorders>
+            <w:vAlign w:val="center"/>
+          </w:tcPr>
+          <w:p>
+            <w:pPr>
+              <w:pStyle w:val="TableContents"/>
+              <w:bidi w:val="0"/>
+              <w:spacing w:before="0" w:after="283"/>
+              <w:rPr/>
+            </w:pPr>
+            <w:r>
+              <w:rPr/>
+              <w:t>2/3</w:t>
+            </w:r>
+          </w:p>
+        </w:tc>
+      </w:tr>
+      <w:tr>
+        <w:trPr/>
+        <w:tc>
+          <w:tcPr>
+            <w:tcW w:w="2074" w:type="dxa"/>
+            <w:tcBorders>
+              <w:left w:val="single" w:sz="6" w:space="0" w:color="808080"/>
+              <w:bottom w:val="single" w:sz="6" w:space="0" w:color="808080"/>
+              <w:right w:val="single" w:sz="6" w:space="0" w:color="808080"/>
+            </w:tcBorders>
+            <w:vAlign w:val="center"/>
+          </w:tcPr>
+          <w:p>
+            <w:pPr>
+              <w:pStyle w:val="TableContents"/>
+              <w:bidi w:val="0"/>
+              <w:spacing w:before="0" w:after="283"/>
+              <w:rPr/>
+            </w:pPr>
+            <w:r>
+              <w:rPr/>
+              <w:t>qwen32b</w:t>
+            </w:r>
+          </w:p>
+        </w:tc>
+        <w:tc>
+          <w:tcPr>
+            <w:tcW w:w="2014" w:type="dxa"/>
+            <w:tcBorders>
+              <w:left w:val="single" w:sz="2" w:space="0" w:color="808080"/>
+              <w:bottom w:val="single" w:sz="6" w:space="0" w:color="808080"/>
+              <w:right w:val="single" w:sz="6" w:space="0" w:color="808080"/>
+            </w:tcBorders>
+            <w:vAlign w:val="center"/>
+          </w:tcPr>
+          <w:p>
+            <w:pPr>
+              <w:pStyle w:val="TableContents"/>
+              <w:bidi w:val="0"/>
+              <w:spacing w:before="0" w:after="283"/>
+              <w:rPr/>
+            </w:pPr>
+            <w:r>
+              <w:rPr/>
+              <w:t>-0.8</w:t>
+            </w:r>
+          </w:p>
+        </w:tc>
+        <w:tc>
+          <w:tcPr>
+            <w:tcW w:w="2611" w:type="dxa"/>
+            <w:tcBorders>
+              <w:left w:val="single" w:sz="2" w:space="0" w:color="808080"/>
+              <w:bottom w:val="single" w:sz="6" w:space="0" w:color="808080"/>
+              <w:right w:val="single" w:sz="6" w:space="0" w:color="808080"/>
+            </w:tcBorders>
+            <w:vAlign w:val="center"/>
+          </w:tcPr>
+          <w:p>
+            <w:pPr>
+              <w:pStyle w:val="TableContents"/>
+              <w:bidi w:val="0"/>
+              <w:spacing w:before="0" w:after="283"/>
+              <w:rPr/>
+            </w:pPr>
+            <w:r>
+              <w:rPr/>
+              <w:t>[-4.7, +2.3]</w:t>
+            </w:r>
+          </w:p>
+        </w:tc>
+        <w:tc>
+          <w:tcPr>
+            <w:tcW w:w="2259" w:type="dxa"/>
+            <w:tcBorders>
+              <w:left w:val="single" w:sz="2" w:space="0" w:color="808080"/>
+              <w:bottom w:val="single" w:sz="6" w:space="0" w:color="808080"/>
+              <w:right w:val="single" w:sz="6" w:space="0" w:color="808080"/>
+            </w:tcBorders>
+            <w:vAlign w:val="center"/>
+          </w:tcPr>
+          <w:p>
+            <w:pPr>
+              <w:pStyle w:val="TableContents"/>
+              <w:bidi w:val="0"/>
+              <w:spacing w:before="0" w:after="283"/>
+              <w:rPr/>
+            </w:pPr>
+            <w:r>
+              <w:rPr/>
+              <w:t>+3.4</w:t>
+            </w:r>
+          </w:p>
+        </w:tc>
+        <w:tc>
+          <w:tcPr>
+            <w:tcW w:w="2380" w:type="dxa"/>
+            <w:tcBorders>
+              <w:left w:val="single" w:sz="2" w:space="0" w:color="808080"/>
+              <w:bottom w:val="single" w:sz="6" w:space="0" w:color="808080"/>
+              <w:right w:val="single" w:sz="6" w:space="0" w:color="808080"/>
+            </w:tcBorders>
+            <w:vAlign w:val="center"/>
+          </w:tcPr>
+          <w:p>
+            <w:pPr>
+              <w:pStyle w:val="TableContents"/>
+              <w:bidi w:val="0"/>
+              <w:spacing w:before="0" w:after="283"/>
+              <w:rPr/>
+            </w:pPr>
+            <w:r>
+              <w:rPr/>
+              <w:t>1/1</w:t>
+            </w:r>
+          </w:p>
+        </w:tc>
+      </w:tr>
+    </w:tbl>
+    <w:tbl>
+      <w:tblPr>
+        <w:tblW w:w="5000" w:type="pct"/>
+        <w:jc w:val="left"/>
+        <w:tblInd w:w="45" w:type="dxa"/>
+        <w:tblLayout w:type="fixed"/>
+        <w:tblCellMar>
+          <w:top w:w="45" w:type="dxa"/>
+          <w:left w:w="45" w:type="dxa"/>
+          <w:bottom w:w="45" w:type="dxa"/>
+          <w:right w:w="45" w:type="dxa"/>
+        </w:tblCellMar>
+      </w:tblPr>
+      <w:tblGrid>
+        <w:gridCol w:w="2236"/>
+        <w:gridCol w:w="5342"/>
+        <w:gridCol w:w="1461"/>
+        <w:gridCol w:w="2300"/>
+      </w:tblGrid>
+      <w:tr>
+        <w:trPr/>
+        <w:tc>
+          <w:tcPr>
+            <w:tcW w:w="2236" w:type="dxa"/>
+            <w:tcBorders>
+              <w:top w:val="single" w:sz="6" w:space="0" w:color="808080"/>
+              <w:left w:val="single" w:sz="6" w:space="0" w:color="808080"/>
+              <w:bottom w:val="single" w:sz="2" w:space="0" w:color="808080"/>
+              <w:right w:val="single" w:sz="6" w:space="0" w:color="808080"/>
+            </w:tcBorders>
+            <w:vAlign w:val="center"/>
+          </w:tcPr>
+          <w:p>
+            <w:pPr>
+              <w:pStyle w:val="TableHeading"/>
+              <w:suppressLineNumbers/>
+              <w:bidi w:val="0"/>
+              <w:spacing w:before="0" w:after="283"/>
+              <w:jc w:val="center"/>
+              <w:rPr/>
+            </w:pPr>
+            <w:r>
+              <w:rPr/>
+              <w:t>Test</w:t>
+            </w:r>
+          </w:p>
+        </w:tc>
+        <w:tc>
+          <w:tcPr>
+            <w:tcW w:w="5342" w:type="dxa"/>
+            <w:tcBorders>
+              <w:top w:val="single" w:sz="6" w:space="0" w:color="808080"/>
+              <w:left w:val="single" w:sz="2" w:space="0" w:color="808080"/>
+              <w:bottom w:val="single" w:sz="2" w:space="0" w:color="808080"/>
+              <w:right w:val="single" w:sz="6" w:space="0" w:color="808080"/>
+            </w:tcBorders>
+            <w:vAlign w:val="center"/>
+          </w:tcPr>
+          <w:p>
+            <w:pPr>
+              <w:pStyle w:val="TableHeading"/>
+              <w:suppressLineNumbers/>
+              <w:bidi w:val="0"/>
+              <w:spacing w:before="0" w:after="283"/>
+              <w:jc w:val="center"/>
+              <w:rPr/>
+            </w:pPr>
+            <w:r>
+              <w:rPr/>
+              <w:t>Estimate</w:t>
+            </w:r>
+          </w:p>
+        </w:tc>
+        <w:tc>
+          <w:tcPr>
+            <w:tcW w:w="1461" w:type="dxa"/>
+            <w:tcBorders>
+              <w:top w:val="single" w:sz="6" w:space="0" w:color="808080"/>
+              <w:left w:val="single" w:sz="2" w:space="0" w:color="808080"/>
+              <w:bottom w:val="single" w:sz="2" w:space="0" w:color="808080"/>
+              <w:right w:val="single" w:sz="6" w:space="0" w:color="808080"/>
+            </w:tcBorders>
+            <w:vAlign w:val="center"/>
+          </w:tcPr>
+          <w:p>
+            <w:pPr>
+              <w:pStyle w:val="TableHeading"/>
+              <w:suppressLineNumbers/>
+              <w:bidi w:val="0"/>
+              <w:spacing w:before="0" w:after="283"/>
+              <w:jc w:val="center"/>
+              <w:rPr/>
+            </w:pPr>
+            <w:r>
+              <w:rPr/>
+              <w:t>One-sided p</w:t>
+            </w:r>
+          </w:p>
+        </w:tc>
+        <w:tc>
+          <w:tcPr>
+            <w:tcW w:w="2300" w:type="dxa"/>
+            <w:tcBorders>
+              <w:top w:val="single" w:sz="6" w:space="0" w:color="808080"/>
+              <w:left w:val="single" w:sz="2" w:space="0" w:color="808080"/>
+              <w:bottom w:val="single" w:sz="2" w:space="0" w:color="808080"/>
+              <w:right w:val="single" w:sz="6" w:space="0" w:color="808080"/>
+            </w:tcBorders>
+            <w:vAlign w:val="center"/>
+          </w:tcPr>
+          <w:p>
+            <w:pPr>
+              <w:pStyle w:val="TableHeading"/>
+              <w:suppressLineNumbers/>
+              <w:bidi w:val="0"/>
+              <w:spacing w:before="0" w:after="283"/>
+              <w:jc w:val="center"/>
+              <w:rPr/>
+            </w:pPr>
+            <w:r>
+              <w:rPr/>
+              <w:t>Verdict</w:t>
+            </w:r>
+          </w:p>
+        </w:tc>
+      </w:tr>
+      <w:tr>
+        <w:trPr/>
+        <w:tc>
+          <w:tcPr>
+            <w:tcW w:w="2236" w:type="dxa"/>
+            <w:tcBorders>
+              <w:left w:val="single" w:sz="6" w:space="0" w:color="808080"/>
+              <w:bottom w:val="single" w:sz="2" w:space="0" w:color="808080"/>
+              <w:right w:val="single" w:sz="6" w:space="0" w:color="808080"/>
+            </w:tcBorders>
+            <w:vAlign w:val="center"/>
+          </w:tcPr>
+          <w:p>
+            <w:pPr>
+              <w:pStyle w:val="TableContents"/>
+              <w:bidi w:val="0"/>
+              <w:spacing w:before="0" w:after="283"/>
+              <w:rPr/>
+            </w:pPr>
+            <w:r>
+              <w:rPr/>
+              <w:t>P1 (primary): gap high+mid minus low fame</w:t>
+            </w:r>
+          </w:p>
+        </w:tc>
+        <w:tc>
+          <w:tcPr>
+            <w:tcW w:w="5342" w:type="dxa"/>
+            <w:tcBorders>
+              <w:left w:val="single" w:sz="2" w:space="0" w:color="808080"/>
+              <w:bottom w:val="single" w:sz="2" w:space="0" w:color="808080"/>
+              <w:right w:val="single" w:sz="6" w:space="0" w:color="808080"/>
+            </w:tcBorders>
+            <w:vAlign w:val="center"/>
+          </w:tcPr>
+          <w:p>
+            <w:pPr>
+              <w:pStyle w:val="TableContents"/>
+              <w:bidi w:val="0"/>
+              <w:spacing w:before="0" w:after="283"/>
+              <w:rPr/>
+            </w:pPr>
+            <w:r>
+              <w:rPr/>
+              <w:t>+7.6 [-1.4, +18.3]; 7 against 25 events; minimum detectable 12.8</w:t>
+            </w:r>
+          </w:p>
+        </w:tc>
+        <w:tc>
+          <w:tcPr>
+            <w:tcW w:w="1461" w:type="dxa"/>
+            <w:tcBorders>
+              <w:left w:val="single" w:sz="2" w:space="0" w:color="808080"/>
+              <w:bottom w:val="single" w:sz="2" w:space="0" w:color="808080"/>
+              <w:right w:val="single" w:sz="6" w:space="0" w:color="808080"/>
+            </w:tcBorders>
+            <w:vAlign w:val="center"/>
+          </w:tcPr>
+          <w:p>
+            <w:pPr>
+              <w:pStyle w:val="TableContents"/>
+              <w:bidi w:val="0"/>
+              <w:spacing w:before="0" w:after="283"/>
+              <w:rPr/>
+            </w:pPr>
+            <w:r>
+              <w:rPr/>
+              <w:t>0.060</w:t>
+            </w:r>
+          </w:p>
+        </w:tc>
+        <w:tc>
+          <w:tcPr>
+            <w:tcW w:w="2300" w:type="dxa"/>
+            <w:tcBorders>
+              <w:left w:val="single" w:sz="2" w:space="0" w:color="808080"/>
+              <w:bottom w:val="single" w:sz="2" w:space="0" w:color="808080"/>
+              <w:right w:val="single" w:sz="6" w:space="0" w:color="808080"/>
+            </w:tcBorders>
+            <w:vAlign w:val="center"/>
+          </w:tcPr>
+          <w:p>
+            <w:pPr>
+              <w:pStyle w:val="TableContents"/>
+              <w:bidi w:val="0"/>
+              <w:spacing w:before="0" w:after="283"/>
+              <w:rPr/>
+            </w:pPr>
+            <w:r>
+              <w:rPr/>
+              <w:t>not passed</w:t>
+            </w:r>
+          </w:p>
+        </w:tc>
+      </w:tr>
+      <w:tr>
+        <w:trPr/>
+        <w:tc>
+          <w:tcPr>
+            <w:tcW w:w="2236" w:type="dxa"/>
+            <w:tcBorders>
+              <w:left w:val="single" w:sz="6" w:space="0" w:color="808080"/>
+              <w:bottom w:val="single" w:sz="2" w:space="0" w:color="808080"/>
+              <w:right w:val="single" w:sz="6" w:space="0" w:color="808080"/>
+            </w:tcBorders>
+            <w:vAlign w:val="center"/>
+          </w:tcPr>
+          <w:p>
+            <w:pPr>
+              <w:pStyle w:val="TableContents"/>
+              <w:bidi w:val="0"/>
+              <w:spacing w:before="0" w:after="283"/>
+              <w:rPr/>
+            </w:pPr>
+            <w:r>
+              <w:rPr/>
+              <w:t>H1: pooled A-B</w:t>
+            </w:r>
+          </w:p>
+        </w:tc>
+        <w:tc>
+          <w:tcPr>
+            <w:tcW w:w="5342" w:type="dxa"/>
+            <w:tcBorders>
+              <w:left w:val="single" w:sz="2" w:space="0" w:color="808080"/>
+              <w:bottom w:val="single" w:sz="2" w:space="0" w:color="808080"/>
+              <w:right w:val="single" w:sz="6" w:space="0" w:color="808080"/>
+            </w:tcBorders>
+            <w:vAlign w:val="center"/>
+          </w:tcPr>
+          <w:p>
+            <w:pPr>
+              <w:pStyle w:val="TableContents"/>
+              <w:bidi w:val="0"/>
+              <w:spacing w:before="0" w:after="283"/>
+              <w:rPr/>
+            </w:pPr>
+            <w:r>
+              <w:rPr/>
+              <w:t>+0.1 [-5.0, +5.2]</w:t>
+            </w:r>
+          </w:p>
+        </w:tc>
+        <w:tc>
+          <w:tcPr>
+            <w:tcW w:w="1461" w:type="dxa"/>
+            <w:tcBorders>
+              <w:left w:val="single" w:sz="2" w:space="0" w:color="808080"/>
+              <w:bottom w:val="single" w:sz="2" w:space="0" w:color="808080"/>
+              <w:right w:val="single" w:sz="6" w:space="0" w:color="808080"/>
+            </w:tcBorders>
+            <w:vAlign w:val="center"/>
+          </w:tcPr>
+          <w:p>
+            <w:pPr>
+              <w:pStyle w:val="TableContents"/>
+              <w:bidi w:val="0"/>
+              <w:spacing w:before="0" w:after="283"/>
+              <w:rPr/>
+            </w:pPr>
+            <w:r>
+              <w:rPr/>
+              <w:t>0.468</w:t>
+            </w:r>
+          </w:p>
+        </w:tc>
+        <w:tc>
+          <w:tcPr>
+            <w:tcW w:w="2300" w:type="dxa"/>
+            <w:tcBorders>
+              <w:left w:val="single" w:sz="2" w:space="0" w:color="808080"/>
+              <w:bottom w:val="single" w:sz="2" w:space="0" w:color="808080"/>
+              <w:right w:val="single" w:sz="6" w:space="0" w:color="808080"/>
+            </w:tcBorders>
+            <w:vAlign w:val="center"/>
+          </w:tcPr>
+          <w:p>
+            <w:pPr>
+              <w:pStyle w:val="TableContents"/>
+              <w:bidi w:val="0"/>
+              <w:spacing w:before="0" w:after="283"/>
+              <w:rPr/>
+            </w:pPr>
+            <w:r>
+              <w:rPr/>
+              <w:t>not passed (3 of the 4 required models only)</w:t>
+            </w:r>
+          </w:p>
+        </w:tc>
+      </w:tr>
+      <w:tr>
+        <w:trPr/>
+        <w:tc>
+          <w:tcPr>
+            <w:tcW w:w="2236" w:type="dxa"/>
+            <w:tcBorders>
+              <w:left w:val="single" w:sz="6" w:space="0" w:color="808080"/>
+              <w:bottom w:val="single" w:sz="2" w:space="0" w:color="808080"/>
+              <w:right w:val="single" w:sz="6" w:space="0" w:color="808080"/>
+            </w:tcBorders>
+            <w:vAlign w:val="center"/>
+          </w:tcPr>
+          <w:p>
+            <w:pPr>
+              <w:pStyle w:val="TableContents"/>
+              <w:bidi w:val="0"/>
+              <w:spacing w:before="0" w:after="283"/>
+              <w:rPr/>
+            </w:pPr>
+            <w:r>
+              <w:rPr/>
+              <w:t>H2: pooled A-B3</w:t>
+            </w:r>
+          </w:p>
+        </w:tc>
+        <w:tc>
+          <w:tcPr>
+            <w:tcW w:w="5342" w:type="dxa"/>
+            <w:tcBorders>
+              <w:left w:val="single" w:sz="2" w:space="0" w:color="808080"/>
+              <w:bottom w:val="single" w:sz="2" w:space="0" w:color="808080"/>
+              <w:right w:val="single" w:sz="6" w:space="0" w:color="808080"/>
+            </w:tcBorders>
+            <w:vAlign w:val="center"/>
+          </w:tcPr>
+          <w:p>
+            <w:pPr>
+              <w:pStyle w:val="TableContents"/>
+              <w:bidi w:val="0"/>
+              <w:spacing w:before="0" w:after="283"/>
+              <w:rPr/>
+            </w:pPr>
+            <w:r>
+              <w:rPr/>
+              <w:t>+5.7 [-1.3, +12.6]</w:t>
+            </w:r>
+          </w:p>
+        </w:tc>
+        <w:tc>
+          <w:tcPr>
+            <w:tcW w:w="1461" w:type="dxa"/>
+            <w:tcBorders>
+              <w:left w:val="single" w:sz="2" w:space="0" w:color="808080"/>
+              <w:bottom w:val="single" w:sz="2" w:space="0" w:color="808080"/>
+              <w:right w:val="single" w:sz="6" w:space="0" w:color="808080"/>
+            </w:tcBorders>
+            <w:vAlign w:val="center"/>
+          </w:tcPr>
+          <w:p>
+            <w:pPr>
+              <w:pStyle w:val="TableContents"/>
+              <w:bidi w:val="0"/>
+              <w:spacing w:before="0" w:after="283"/>
+              <w:rPr/>
+            </w:pPr>
+            <w:r>
+              <w:rPr/>
+              <w:t>0.036</w:t>
+            </w:r>
+          </w:p>
+        </w:tc>
+        <w:tc>
+          <w:tcPr>
+            <w:tcW w:w="2300" w:type="dxa"/>
+            <w:tcBorders>
+              <w:left w:val="single" w:sz="2" w:space="0" w:color="808080"/>
+              <w:bottom w:val="single" w:sz="2" w:space="0" w:color="808080"/>
+              <w:right w:val="single" w:sz="6" w:space="0" w:color="808080"/>
+            </w:tcBorders>
+            <w:vAlign w:val="center"/>
+          </w:tcPr>
+          <w:p>
+            <w:pPr>
+              <w:pStyle w:val="TableContents"/>
+              <w:bidi w:val="0"/>
+              <w:spacing w:before="0" w:after="283"/>
+              <w:rPr/>
+            </w:pPr>
+            <w:r>
+              <w:rPr/>
+              <w:t>not passed</w:t>
+            </w:r>
+          </w:p>
+        </w:tc>
+      </w:tr>
+      <w:tr>
+        <w:trPr/>
+        <w:tc>
+          <w:tcPr>
+            <w:tcW w:w="2236" w:type="dxa"/>
+            <w:tcBorders>
+              <w:left w:val="single" w:sz="6" w:space="0" w:color="808080"/>
+              <w:bottom w:val="single" w:sz="2" w:space="0" w:color="808080"/>
+              <w:right w:val="single" w:sz="6" w:space="0" w:color="808080"/>
+            </w:tcBorders>
+            <w:vAlign w:val="center"/>
+          </w:tcPr>
+          <w:p>
+            <w:pPr>
+              <w:pStyle w:val="TableContents"/>
+              <w:bidi w:val="0"/>
+              <w:spacing w:before="0" w:after="283"/>
+              <w:rPr/>
+            </w:pPr>
+            <w:r>
+              <w:rPr/>
+              <w:t>H3: Spearman fame vs gap</w:t>
+            </w:r>
+          </w:p>
+        </w:tc>
+        <w:tc>
+          <w:tcPr>
+            <w:tcW w:w="5342" w:type="dxa"/>
+            <w:tcBorders>
+              <w:left w:val="single" w:sz="2" w:space="0" w:color="808080"/>
+              <w:bottom w:val="single" w:sz="2" w:space="0" w:color="808080"/>
+              <w:right w:val="single" w:sz="6" w:space="0" w:color="808080"/>
+            </w:tcBorders>
+            <w:vAlign w:val="center"/>
+          </w:tcPr>
+          <w:p>
+            <w:pPr>
+              <w:pStyle w:val="TableContents"/>
+              <w:bidi w:val="0"/>
+              <w:spacing w:before="0" w:after="283"/>
+              <w:rPr/>
+            </w:pPr>
+            <w:r>
+              <w:rPr/>
+              <w:t>+0.30 (32 events, 31 books)</w:t>
+            </w:r>
+          </w:p>
+        </w:tc>
+        <w:tc>
+          <w:tcPr>
+            <w:tcW w:w="1461" w:type="dxa"/>
+            <w:tcBorders>
+              <w:left w:val="single" w:sz="2" w:space="0" w:color="808080"/>
+              <w:bottom w:val="single" w:sz="2" w:space="0" w:color="808080"/>
+              <w:right w:val="single" w:sz="6" w:space="0" w:color="808080"/>
+            </w:tcBorders>
+            <w:vAlign w:val="center"/>
+          </w:tcPr>
+          <w:p>
+            <w:pPr>
+              <w:pStyle w:val="TableContents"/>
+              <w:bidi w:val="0"/>
+              <w:spacing w:before="0" w:after="283"/>
+              <w:rPr/>
+            </w:pPr>
+            <w:r>
+              <w:rPr/>
+              <w:t>0.041 raw, 0.145 Holm</w:t>
+            </w:r>
+          </w:p>
+        </w:tc>
+        <w:tc>
+          <w:tcPr>
+            <w:tcW w:w="2300" w:type="dxa"/>
+            <w:tcBorders>
+              <w:left w:val="single" w:sz="2" w:space="0" w:color="808080"/>
+              <w:bottom w:val="single" w:sz="2" w:space="0" w:color="808080"/>
+              <w:right w:val="single" w:sz="6" w:space="0" w:color="808080"/>
+            </w:tcBorders>
+            <w:vAlign w:val="center"/>
+          </w:tcPr>
+          <w:p>
+            <w:pPr>
+              <w:pStyle w:val="TableContents"/>
+              <w:bidi w:val="0"/>
+              <w:spacing w:before="0" w:after="283"/>
+              <w:rPr/>
+            </w:pPr>
+            <w:r>
+              <w:rPr/>
+              <w:t>raw rule met, not confirmed after Holm</w:t>
+            </w:r>
+          </w:p>
+        </w:tc>
+      </w:tr>
+      <w:tr>
+        <w:trPr/>
+        <w:tc>
+          <w:tcPr>
+            <w:tcW w:w="2236" w:type="dxa"/>
+            <w:tcBorders>
+              <w:left w:val="single" w:sz="6" w:space="0" w:color="808080"/>
+              <w:bottom w:val="single" w:sz="6" w:space="0" w:color="808080"/>
+              <w:right w:val="single" w:sz="6" w:space="0" w:color="808080"/>
+            </w:tcBorders>
+            <w:vAlign w:val="center"/>
+          </w:tcPr>
+          <w:p>
+            <w:pPr>
+              <w:pStyle w:val="TableContents"/>
+              <w:bidi w:val="0"/>
+              <w:spacing w:before="0" w:after="283"/>
+              <w:rPr/>
+            </w:pPr>
+            <w:r>
+              <w:rPr/>
+              <w:t>H5: pseudonymisation (P2)</w:t>
+            </w:r>
+          </w:p>
+        </w:tc>
+        <w:tc>
+          <w:tcPr>
+            <w:tcW w:w="5342" w:type="dxa"/>
+            <w:tcBorders>
+              <w:left w:val="single" w:sz="2" w:space="0" w:color="808080"/>
+              <w:bottom w:val="single" w:sz="6" w:space="0" w:color="808080"/>
+              <w:right w:val="single" w:sz="6" w:space="0" w:color="808080"/>
+            </w:tcBorders>
+            <w:vAlign w:val="center"/>
+          </w:tcPr>
+          <w:p>
+            <w:pPr>
+              <w:pStyle w:val="TableContents"/>
+              <w:bidi w:val="0"/>
+              <w:spacing w:before="0" w:after="283"/>
+              <w:rPr/>
+            </w:pPr>
+            <w:r>
+              <w:rPr/>
+              <w:t>pre-reveal premature naming 5.0% to 2.6%; post-reveal accuracy -6.7 [-13.3, -2.2]; control accuracy -15.6 [-22.9, -8.9]</w:t>
+            </w:r>
+          </w:p>
+        </w:tc>
+        <w:tc>
+          <w:tcPr>
+            <w:tcW w:w="1461" w:type="dxa"/>
+            <w:tcBorders>
+              <w:left w:val="single" w:sz="2" w:space="0" w:color="808080"/>
+              <w:bottom w:val="single" w:sz="6" w:space="0" w:color="808080"/>
+              <w:right w:val="single" w:sz="6" w:space="0" w:color="808080"/>
+            </w:tcBorders>
+            <w:vAlign w:val="center"/>
+          </w:tcPr>
+          <w:p>
+            <w:pPr>
+              <w:pStyle w:val="TableContents"/>
+              <w:bidi w:val="0"/>
+              <w:spacing w:before="0" w:after="283"/>
+              <w:rPr/>
+            </w:pPr>
+            <w:r>
+              <w:rPr/>
+              <w:t>0.037</w:t>
+            </w:r>
+          </w:p>
+        </w:tc>
+        <w:tc>
+          <w:tcPr>
+            <w:tcW w:w="2300" w:type="dxa"/>
+            <w:tcBorders>
+              <w:left w:val="single" w:sz="2" w:space="0" w:color="808080"/>
+              <w:bottom w:val="single" w:sz="6" w:space="0" w:color="808080"/>
+              <w:right w:val="single" w:sz="6" w:space="0" w:color="808080"/>
+            </w:tcBorders>
+            <w:vAlign w:val="center"/>
+          </w:tcPr>
+          <w:p>
+            <w:pPr>
+              <w:pStyle w:val="TableContents"/>
+              <w:bidi w:val="0"/>
+              <w:spacing w:before="0" w:after="283"/>
+              <w:rPr/>
+            </w:pPr>
+            <w:r>
+              <w:rPr/>
+              <w:t>not met (utility outside the 5-point margin)</w:t>
+            </w:r>
+          </w:p>
+        </w:tc>
+      </w:tr>
+    </w:tbl>
+    <w:p>
+      <w:pPr>
+        <w:pStyle w:val="BodyText"/>
+        <w:bidi w:val="0"/>
+        <w:rPr/>
+      </w:pPr>
+      <w:r>
+        <w:rPr/>
+        <w:t>Closed-book recovery of the identity: 2 of 68 events for each model. E5 (24 events, 3 models, 144 outputs per condition): 0 spoilers detected in every condition; second-model faithfulness check 90.0% to 90.9% supported. E2 (17 verified LLM-authored stories): gaps +0.0, +1.5 [0.0, +4.4], -1.5 [-4.4, 0.0] (Mistral, OLMo, Qwen). OLMo training-data check (infini-gram on the OLMo-2 1124 corpus, 62 books, 50 with a gap): Spearman +0.13, permutation p = 0.41; mean gap +2.9 for books present against +1.0 absent. Claude Sonnet 5.5 arm: stopped by the subscription session limit after 211 of 1,218 answers (8 events), excluded from all pooled tests (</w:t>
+      </w:r>
+      <w:r>
+        <w:rPr>
+          <w:rStyle w:val="SourceText"/>
+        </w:rPr>
+        <w:t>PD_CONFIRM_deviations.md</w:t>
+      </w:r>
+      <w:r>
+        <w:rPr/>
+        <w:t>).</w:t>
+      </w:r>
+    </w:p>
+    <w:p>
+      <w:pPr>
+        <w:pStyle w:val="BodyText"/>
+        <w:bidi w:val="0"/>
+        <w:rPr/>
+      </w:pPr>
+      <w:r>
+        <w:rPr>
+          <w:b/>
+        </w:rPr>
+        <w:t>Reading.</w:t>
+      </w:r>
+      <w:r>
+        <w:rPr/>
+        <w:t xml:space="preserve"> The confirmatory run does not detect the effect on a sample dominated by obscure books and does not resolve the fame contrast. It is consistent with the exploratory dose-response (no memory to leak when the books are not recognised) and it does not contradict the famous-book results; it bounds the pooled gap on obscure books at about 5 points. Nothing in it shows that the effect is absent on famous books; the high band was exhausted with 2 events. E5 and the OLMo link are nulls under narrow detectors. Source: </w:t>
+      </w:r>
+      <w:r>
+        <w:rPr>
+          <w:rStyle w:val="SourceText"/>
+        </w:rPr>
+        <w:t>data/eval/chimera/confirm/{main,e2}/analysis.json</w:t>
+      </w:r>
+      <w:r>
+        <w:rPr/>
+        <w:t xml:space="preserve">, </w:t>
+      </w:r>
+      <w:r>
+        <w:rPr>
+          <w:rStyle w:val="SourceText"/>
+        </w:rPr>
+        <w:t>olmo_corpus_check.json</w:t>
+      </w:r>
+      <w:r>
+        <w:rPr/>
+        <w:t xml:space="preserve">; tables by </w:t>
+      </w:r>
+      <w:r>
+        <w:rPr>
+          <w:rStyle w:val="SourceText"/>
+        </w:rPr>
+        <w:t>python scripts/chimera/gen_ch1_tables.py</w:t>
+      </w:r>
+      <w:r>
+        <w:rPr/>
+        <w:t>.</w:t>
+      </w:r>
+    </w:p>
+    <w:p>
+      <w:pPr>
         <w:pStyle w:val="Heading2"/>
         <w:bidi w:val="0"/>
         <w:rPr/>
@@ -31733,7 +33027,7 @@
             <w:tcW w:w="3938" w:type="dxa"/>
             <w:tcBorders>
               <w:left w:val="single" w:sz="6" w:space="0" w:color="808080"/>
-              <w:bottom w:val="single" w:sz="6" w:space="0" w:color="808080"/>
+              <w:bottom w:val="single" w:sz="2" w:space="0" w:color="808080"/>
               <w:right w:val="single" w:sz="6" w:space="0" w:color="808080"/>
             </w:tcBorders>
             <w:vAlign w:val="center"/>
@@ -31756,7 +33050,7 @@
             <w:tcW w:w="7401" w:type="dxa"/>
             <w:tcBorders>
               <w:left w:val="single" w:sz="2" w:space="0" w:color="808080"/>
-              <w:bottom w:val="single" w:sz="6" w:space="0" w:color="808080"/>
+              <w:bottom w:val="single" w:sz="2" w:space="0" w:color="808080"/>
               <w:right w:val="single" w:sz="6" w:space="0" w:color="808080"/>
             </w:tcBorders>
             <w:vAlign w:val="center"/>
@@ -31783,6 +33077,107 @@
                 <w:rStyle w:val="SourceText"/>
               </w:rPr>
               <w:t>python scripts/chimera/pd_dose_response.py</w:t>
+            </w:r>
+          </w:p>
+        </w:tc>
+      </w:tr>
+      <w:tr>
+        <w:trPr/>
+        <w:tc>
+          <w:tcPr>
+            <w:tcW w:w="3938" w:type="dxa"/>
+            <w:tcBorders>
+              <w:left w:val="single" w:sz="6" w:space="0" w:color="808080"/>
+              <w:bottom w:val="single" w:sz="6" w:space="0" w:color="808080"/>
+              <w:right w:val="single" w:sz="6" w:space="0" w:color="808080"/>
+            </w:tcBorders>
+            <w:vAlign w:val="center"/>
+          </w:tcPr>
+          <w:p>
+            <w:pPr>
+              <w:pStyle w:val="TableContents"/>
+              <w:bidi w:val="0"/>
+              <w:spacing w:before="0" w:after="283"/>
+              <w:rPr/>
+            </w:pPr>
+            <w:r>
+              <w:rPr/>
+              <w:t>PD CONFIRM v2 (5.23): 68 events, primary 32; pooled A-B +0.1 [-5.0, +5.2]; P1 +7.6 [-1.4, +18.3] p 0.060; H2 +5.7; H3 +0.30 (Holm 0.145); E4 5.0% to 2.6%; E5 0 spoilers; OLMo link +0.13 p 0.41</w:t>
+            </w:r>
+          </w:p>
+        </w:tc>
+        <w:tc>
+          <w:tcPr>
+            <w:tcW w:w="7401" w:type="dxa"/>
+            <w:tcBorders>
+              <w:left w:val="single" w:sz="2" w:space="0" w:color="808080"/>
+              <w:bottom w:val="single" w:sz="6" w:space="0" w:color="808080"/>
+              <w:right w:val="single" w:sz="6" w:space="0" w:color="808080"/>
+            </w:tcBorders>
+            <w:vAlign w:val="center"/>
+          </w:tcPr>
+          <w:p>
+            <w:pPr>
+              <w:pStyle w:val="TableContents"/>
+              <w:bidi w:val="0"/>
+              <w:spacing w:before="0" w:after="283"/>
+              <w:rPr/>
+            </w:pPr>
+            <w:r>
+              <w:rPr>
+                <w:rStyle w:val="SourceText"/>
+              </w:rPr>
+              <w:t>data/eval/chimera/confirm/main/analysis.json</w:t>
+            </w:r>
+            <w:r>
+              <w:rPr/>
+              <w:t xml:space="preserve">, </w:t>
+            </w:r>
+            <w:r>
+              <w:rPr>
+                <w:rStyle w:val="SourceText"/>
+              </w:rPr>
+              <w:t>e2/analysis.json</w:t>
+            </w:r>
+            <w:r>
+              <w:rPr/>
+              <w:t xml:space="preserve">, </w:t>
+            </w:r>
+            <w:r>
+              <w:rPr>
+                <w:rStyle w:val="SourceText"/>
+              </w:rPr>
+              <w:t>main/olmo_corpus_check.json</w:t>
+            </w:r>
+            <w:r>
+              <w:rPr/>
+              <w:t xml:space="preserve">; </w:t>
+            </w:r>
+            <w:r>
+              <w:rPr>
+                <w:rStyle w:val="SourceText"/>
+              </w:rPr>
+              <w:t>python scripts/chimera/pd_confirm_analyze.py</w:t>
+            </w:r>
+            <w:r>
+              <w:rPr/>
+              <w:t xml:space="preserve">; </w:t>
+            </w:r>
+            <w:r>
+              <w:rPr>
+                <w:rStyle w:val="SourceText"/>
+              </w:rPr>
+              <w:t>scripts/chimera/gen_ch1_tables.py</w:t>
+            </w:r>
+            <w:r>
+              <w:rPr/>
+              <w:t xml:space="preserve">; </w:t>
+            </w:r>
+            <w:r>
+              <w:rPr>
+                <w:rStyle w:val="SourceText"/>
+              </w:rPr>
+              <w:t>docs/research/preregistrations/PD_CONFIRM_deviations.md</w:t>
             </w:r>
           </w:p>
         </w:tc>

</xml_diff>